<commit_message>
docs: regenerate sample report with default PentestIQ branding
The committed example incorrectly showed a demo white-label brand ('Acme Security
Consulting'). Regenerated with default branding so the sample reads 'Prepared by
PentestIQ'. Per-tenant white-labeling remains available via PUT /settings.
</commit_message>
<xml_diff>
--- a/examples/sample-report/report.docx
+++ b/examples/sample-report/report.docx
@@ -8,14 +8,14 @@
       </w:pPr>
       <w:r>
         <w:rPr>
-          <w:color w:val="1E3A8A"/>
+          <w:color w:val="0F172A"/>
         </w:rPr>
-        <w:t>VAPT Report — Acme Corp — External Web &amp; Infra Assessment</w:t>
+        <w:t>VAPT Report — Example Corp — External Web &amp; Infra Assessment</w:t>
       </w:r>
     </w:p>
     <w:p>
       <w:r>
-        <w:t>Prepared by Acme Security Consulting · 2026-08-31 09:56 UTC</w:t>
+        <w:t>Prepared by PentestIQ · 2026-08-31 09:59 UTC</w:t>
       </w:r>
     </w:p>
     <w:p>
@@ -28,7 +28,7 @@
     </w:p>
     <w:p>
       <w:r>
-        <w:t>PentestIQ assessed 2 assets for engagement "Acme Corp — External Web &amp; Infra Assessment" and identified 8 findings (overall risk rating: Critical). By severity: 1 critical, 1 high, 1 medium, 2 low. 1 finding was safely validated as exploitable through non-destructive checks (including: SQL Injection), removing false-positive doubt. The highest-priority item is "SQL Injection" (high, risk 95) on web:http://10.0.0.5:80.</w:t>
+        <w:t>PentestIQ assessed 2 assets for engagement "Example Corp — External Web &amp; Infra Assessment" and identified 8 findings (overall risk rating: Critical). By severity: 1 critical, 1 high, 1 medium, 2 low. 1 finding was safely validated as exploitable through non-destructive checks (including: SQL Injection), removing false-positive doubt. The highest-priority item is "SQL Injection" (high, risk 95) on web:http://10.0.0.5:80.</w:t>
       </w:r>
     </w:p>
     <w:p>
@@ -813,7 +813,7 @@
         <w:rPr>
           <w:sz w:val="16"/>
         </w:rPr>
-        <w:t>Authorized use only. Testing performed under an agreed engagement scope. Findings are confidential. Confidential — prepared for Acme Corp.</w:t>
+        <w:t>Authorized use only. Testing performed under an agreed engagement scope. Findings are confidential.</w:t>
       </w:r>
     </w:p>
     <w:sectPr>

</xml_diff>